<commit_message>
Add SQL DML homework tasks
</commit_message>
<xml_diff>
--- a/DB_Tamar_Tutisani_HW_RecruitmentAgency_descriptions.docx
+++ b/DB_Tamar_Tutisani_HW_RecruitmentAgency_descriptions.docx
@@ -257,10 +257,10 @@
     </w:p>
     <w:bookmarkStart w:id="0" w:name="_Section_1" w:displacedByCustomXml="next"/>
     <w:bookmarkEnd w:id="0" w:displacedByCustomXml="next"/>
-    <w:bookmarkStart w:id="1" w:name="_Toc4475558" w:displacedByCustomXml="next"/>
-    <w:bookmarkStart w:id="2" w:name="_Toc2484421" w:displacedByCustomXml="next"/>
-    <w:bookmarkStart w:id="3" w:name="_Toc456600918" w:displacedByCustomXml="next"/>
-    <w:bookmarkStart w:id="4" w:name="_Toc456598587" w:displacedByCustomXml="next"/>
+    <w:bookmarkStart w:id="1" w:name="_Toc456598587" w:displacedByCustomXml="next"/>
+    <w:bookmarkStart w:id="2" w:name="_Toc456600918" w:displacedByCustomXml="next"/>
+    <w:bookmarkStart w:id="3" w:name="_Toc2484421" w:displacedByCustomXml="next"/>
+    <w:bookmarkStart w:id="4" w:name="_Toc4475558" w:displacedByCustomXml="next"/>
     <w:sdt>
       <w:sdtPr>
         <w:rPr>
@@ -319,7 +319,7 @@
           <w:r>
             <w:fldChar w:fldCharType="separate"/>
           </w:r>
-          <w:hyperlink w:anchor="_Toc225207685" w:history="1">
+          <w:hyperlink w:anchor="_Toc225208627" w:history="1">
             <w:r>
               <w:rPr>
                 <w:rStyle w:val="Hyperlink"/>
@@ -368,7 +368,7 @@
                 <w:noProof/>
                 <w:webHidden/>
               </w:rPr>
-              <w:instrText xml:space="preserve"> PAGEREF _Toc225207685 \h </w:instrText>
+              <w:instrText xml:space="preserve"> PAGEREF _Toc225208627 \h </w:instrText>
             </w:r>
             <w:r>
               <w:rPr>
@@ -415,7 +415,7 @@
               <w14:ligatures w14:val="standardContextual"/>
             </w:rPr>
           </w:pPr>
-          <w:hyperlink w:anchor="_Toc225207686" w:history="1">
+          <w:hyperlink w:anchor="_Toc225208628" w:history="1">
             <w:r>
               <w:rPr>
                 <w:rStyle w:val="Hyperlink"/>
@@ -462,7 +462,7 @@
                 <w:noProof/>
                 <w:webHidden/>
               </w:rPr>
-              <w:instrText xml:space="preserve"> PAGEREF _Toc225207686 \h </w:instrText>
+              <w:instrText xml:space="preserve"> PAGEREF _Toc225208628 \h </w:instrText>
             </w:r>
             <w:r>
               <w:rPr>
@@ -511,7 +511,7 @@
               <w14:ligatures w14:val="standardContextual"/>
             </w:rPr>
           </w:pPr>
-          <w:hyperlink w:anchor="_Toc225207687" w:history="1">
+          <w:hyperlink w:anchor="_Toc225208629" w:history="1">
             <w:r>
               <w:rPr>
                 <w:rStyle w:val="Hyperlink"/>
@@ -560,7 +560,7 @@
                 <w:noProof/>
                 <w:webHidden/>
               </w:rPr>
-              <w:instrText xml:space="preserve"> PAGEREF _Toc225207687 \h </w:instrText>
+              <w:instrText xml:space="preserve"> PAGEREF _Toc225208629 \h </w:instrText>
             </w:r>
             <w:r>
               <w:rPr>
@@ -607,7 +607,7 @@
               <w14:ligatures w14:val="standardContextual"/>
             </w:rPr>
           </w:pPr>
-          <w:hyperlink w:anchor="_Toc225207688" w:history="1">
+          <w:hyperlink w:anchor="_Toc225208630" w:history="1">
             <w:r>
               <w:rPr>
                 <w:rStyle w:val="Hyperlink"/>
@@ -654,7 +654,7 @@
                 <w:noProof/>
                 <w:webHidden/>
               </w:rPr>
-              <w:instrText xml:space="preserve"> PAGEREF _Toc225207688 \h </w:instrText>
+              <w:instrText xml:space="preserve"> PAGEREF _Toc225208630 \h </w:instrText>
             </w:r>
             <w:r>
               <w:rPr>
@@ -701,7 +701,7 @@
               <w14:ligatures w14:val="standardContextual"/>
             </w:rPr>
           </w:pPr>
-          <w:hyperlink w:anchor="_Toc225207689" w:history="1">
+          <w:hyperlink w:anchor="_Toc225208631" w:history="1">
             <w:r>
               <w:rPr>
                 <w:rStyle w:val="Hyperlink"/>
@@ -748,7 +748,7 @@
                 <w:noProof/>
                 <w:webHidden/>
               </w:rPr>
-              <w:instrText xml:space="preserve"> PAGEREF _Toc225207689 \h </w:instrText>
+              <w:instrText xml:space="preserve"> PAGEREF _Toc225208631 \h </w:instrText>
             </w:r>
             <w:r>
               <w:rPr>
@@ -795,7 +795,7 @@
               <w14:ligatures w14:val="standardContextual"/>
             </w:rPr>
           </w:pPr>
-          <w:hyperlink w:anchor="_Toc225207690" w:history="1">
+          <w:hyperlink w:anchor="_Toc225208632" w:history="1">
             <w:r>
               <w:rPr>
                 <w:rStyle w:val="Hyperlink"/>
@@ -842,7 +842,7 @@
                 <w:noProof/>
                 <w:webHidden/>
               </w:rPr>
-              <w:instrText xml:space="preserve"> PAGEREF _Toc225207690 \h </w:instrText>
+              <w:instrText xml:space="preserve"> PAGEREF _Toc225208632 \h </w:instrText>
             </w:r>
             <w:r>
               <w:rPr>
@@ -889,7 +889,7 @@
               <w14:ligatures w14:val="standardContextual"/>
             </w:rPr>
           </w:pPr>
-          <w:hyperlink w:anchor="_Toc225207691" w:history="1">
+          <w:hyperlink w:anchor="_Toc225208633" w:history="1">
             <w:r>
               <w:rPr>
                 <w:rStyle w:val="Hyperlink"/>
@@ -916,7 +916,7 @@
                 <w:rFonts w:eastAsia="MS Gothic"/>
                 <w:noProof/>
               </w:rPr>
-              <w:t>Regions</w:t>
+              <w:t>regions</w:t>
             </w:r>
             <w:r>
               <w:rPr>
@@ -937,7 +937,7 @@
                 <w:noProof/>
                 <w:webHidden/>
               </w:rPr>
-              <w:instrText xml:space="preserve"> PAGEREF _Toc225207691 \h </w:instrText>
+              <w:instrText xml:space="preserve"> PAGEREF _Toc225208633 \h </w:instrText>
             </w:r>
             <w:r>
               <w:rPr>
@@ -984,7 +984,7 @@
               <w14:ligatures w14:val="standardContextual"/>
             </w:rPr>
           </w:pPr>
-          <w:hyperlink w:anchor="_Toc225207692" w:history="1">
+          <w:hyperlink w:anchor="_Toc225208634" w:history="1">
             <w:r>
               <w:rPr>
                 <w:rStyle w:val="Hyperlink"/>
@@ -1032,7 +1032,7 @@
                 <w:noProof/>
                 <w:webHidden/>
               </w:rPr>
-              <w:instrText xml:space="preserve"> PAGEREF _Toc225207692 \h </w:instrText>
+              <w:instrText xml:space="preserve"> PAGEREF _Toc225208634 \h </w:instrText>
             </w:r>
             <w:r>
               <w:rPr>
@@ -1079,7 +1079,7 @@
               <w14:ligatures w14:val="standardContextual"/>
             </w:rPr>
           </w:pPr>
-          <w:hyperlink w:anchor="_Toc225207693" w:history="1">
+          <w:hyperlink w:anchor="_Toc225208635" w:history="1">
             <w:r>
               <w:rPr>
                 <w:rStyle w:val="Hyperlink"/>
@@ -1127,7 +1127,7 @@
                 <w:noProof/>
                 <w:webHidden/>
               </w:rPr>
-              <w:instrText xml:space="preserve"> PAGEREF _Toc225207693 \h </w:instrText>
+              <w:instrText xml:space="preserve"> PAGEREF _Toc225208635 \h </w:instrText>
             </w:r>
             <w:r>
               <w:rPr>
@@ -1174,7 +1174,7 @@
               <w14:ligatures w14:val="standardContextual"/>
             </w:rPr>
           </w:pPr>
-          <w:hyperlink w:anchor="_Toc225207694" w:history="1">
+          <w:hyperlink w:anchor="_Toc225208636" w:history="1">
             <w:r>
               <w:rPr>
                 <w:rStyle w:val="Hyperlink"/>
@@ -1222,7 +1222,7 @@
                 <w:noProof/>
                 <w:webHidden/>
               </w:rPr>
-              <w:instrText xml:space="preserve"> PAGEREF _Toc225207694 \h </w:instrText>
+              <w:instrText xml:space="preserve"> PAGEREF _Toc225208636 \h </w:instrText>
             </w:r>
             <w:r>
               <w:rPr>
@@ -1269,7 +1269,7 @@
               <w14:ligatures w14:val="standardContextual"/>
             </w:rPr>
           </w:pPr>
-          <w:hyperlink w:anchor="_Toc225207695" w:history="1">
+          <w:hyperlink w:anchor="_Toc225208637" w:history="1">
             <w:r>
               <w:rPr>
                 <w:rStyle w:val="Hyperlink"/>
@@ -1317,7 +1317,7 @@
                 <w:noProof/>
                 <w:webHidden/>
               </w:rPr>
-              <w:instrText xml:space="preserve"> PAGEREF _Toc225207695 \h </w:instrText>
+              <w:instrText xml:space="preserve"> PAGEREF _Toc225208637 \h </w:instrText>
             </w:r>
             <w:r>
               <w:rPr>
@@ -1364,7 +1364,7 @@
               <w14:ligatures w14:val="standardContextual"/>
             </w:rPr>
           </w:pPr>
-          <w:hyperlink w:anchor="_Toc225207696" w:history="1">
+          <w:hyperlink w:anchor="_Toc225208638" w:history="1">
             <w:r>
               <w:rPr>
                 <w:rStyle w:val="Hyperlink"/>
@@ -1412,7 +1412,7 @@
                 <w:noProof/>
                 <w:webHidden/>
               </w:rPr>
-              <w:instrText xml:space="preserve"> PAGEREF _Toc225207696 \h </w:instrText>
+              <w:instrText xml:space="preserve"> PAGEREF _Toc225208638 \h </w:instrText>
             </w:r>
             <w:r>
               <w:rPr>
@@ -1459,7 +1459,7 @@
               <w14:ligatures w14:val="standardContextual"/>
             </w:rPr>
           </w:pPr>
-          <w:hyperlink w:anchor="_Toc225207697" w:history="1">
+          <w:hyperlink w:anchor="_Toc225208639" w:history="1">
             <w:r>
               <w:rPr>
                 <w:rStyle w:val="Hyperlink"/>
@@ -1507,7 +1507,7 @@
                 <w:noProof/>
                 <w:webHidden/>
               </w:rPr>
-              <w:instrText xml:space="preserve"> PAGEREF _Toc225207697 \h </w:instrText>
+              <w:instrText xml:space="preserve"> PAGEREF _Toc225208639 \h </w:instrText>
             </w:r>
             <w:r>
               <w:rPr>
@@ -1554,7 +1554,7 @@
               <w14:ligatures w14:val="standardContextual"/>
             </w:rPr>
           </w:pPr>
-          <w:hyperlink w:anchor="_Toc225207698" w:history="1">
+          <w:hyperlink w:anchor="_Toc225208640" w:history="1">
             <w:r>
               <w:rPr>
                 <w:rStyle w:val="Hyperlink"/>
@@ -1602,7 +1602,7 @@
                 <w:noProof/>
                 <w:webHidden/>
               </w:rPr>
-              <w:instrText xml:space="preserve"> PAGEREF _Toc225207698 \h </w:instrText>
+              <w:instrText xml:space="preserve"> PAGEREF _Toc225208640 \h </w:instrText>
             </w:r>
             <w:r>
               <w:rPr>
@@ -1649,7 +1649,7 @@
               <w14:ligatures w14:val="standardContextual"/>
             </w:rPr>
           </w:pPr>
-          <w:hyperlink w:anchor="_Toc225207699" w:history="1">
+          <w:hyperlink w:anchor="_Toc225208641" w:history="1">
             <w:r>
               <w:rPr>
                 <w:rStyle w:val="Hyperlink"/>
@@ -1697,7 +1697,7 @@
                 <w:noProof/>
                 <w:webHidden/>
               </w:rPr>
-              <w:instrText xml:space="preserve"> PAGEREF _Toc225207699 \h </w:instrText>
+              <w:instrText xml:space="preserve"> PAGEREF _Toc225208641 \h </w:instrText>
             </w:r>
             <w:r>
               <w:rPr>
@@ -1744,7 +1744,7 @@
               <w14:ligatures w14:val="standardContextual"/>
             </w:rPr>
           </w:pPr>
-          <w:hyperlink w:anchor="_Toc225207700" w:history="1">
+          <w:hyperlink w:anchor="_Toc225208642" w:history="1">
             <w:r>
               <w:rPr>
                 <w:rStyle w:val="Hyperlink"/>
@@ -1792,7 +1792,7 @@
                 <w:noProof/>
                 <w:webHidden/>
               </w:rPr>
-              <w:instrText xml:space="preserve"> PAGEREF _Toc225207700 \h </w:instrText>
+              <w:instrText xml:space="preserve"> PAGEREF _Toc225208642 \h </w:instrText>
             </w:r>
             <w:r>
               <w:rPr>
@@ -1839,7 +1839,7 @@
               <w14:ligatures w14:val="standardContextual"/>
             </w:rPr>
           </w:pPr>
-          <w:hyperlink w:anchor="_Toc225207701" w:history="1">
+          <w:hyperlink w:anchor="_Toc225208643" w:history="1">
             <w:r>
               <w:rPr>
                 <w:rStyle w:val="Hyperlink"/>
@@ -1887,7 +1887,7 @@
                 <w:noProof/>
                 <w:webHidden/>
               </w:rPr>
-              <w:instrText xml:space="preserve"> PAGEREF _Toc225207701 \h </w:instrText>
+              <w:instrText xml:space="preserve"> PAGEREF _Toc225208643 \h </w:instrText>
             </w:r>
             <w:r>
               <w:rPr>
@@ -1934,7 +1934,7 @@
               <w14:ligatures w14:val="standardContextual"/>
             </w:rPr>
           </w:pPr>
-          <w:hyperlink w:anchor="_Toc225207702" w:history="1">
+          <w:hyperlink w:anchor="_Toc225208644" w:history="1">
             <w:r>
               <w:rPr>
                 <w:rStyle w:val="Hyperlink"/>
@@ -1982,7 +1982,7 @@
                 <w:noProof/>
                 <w:webHidden/>
               </w:rPr>
-              <w:instrText xml:space="preserve"> PAGEREF _Toc225207702 \h </w:instrText>
+              <w:instrText xml:space="preserve"> PAGEREF _Toc225208644 \h </w:instrText>
             </w:r>
             <w:r>
               <w:rPr>
@@ -2029,7 +2029,7 @@
               <w14:ligatures w14:val="standardContextual"/>
             </w:rPr>
           </w:pPr>
-          <w:hyperlink w:anchor="_Toc225207703" w:history="1">
+          <w:hyperlink w:anchor="_Toc225208645" w:history="1">
             <w:r>
               <w:rPr>
                 <w:rStyle w:val="Hyperlink"/>
@@ -2077,7 +2077,7 @@
                 <w:noProof/>
                 <w:webHidden/>
               </w:rPr>
-              <w:instrText xml:space="preserve"> PAGEREF _Toc225207703 \h </w:instrText>
+              <w:instrText xml:space="preserve"> PAGEREF _Toc225208645 \h </w:instrText>
             </w:r>
             <w:r>
               <w:rPr>
@@ -2124,7 +2124,7 @@
               <w14:ligatures w14:val="standardContextual"/>
             </w:rPr>
           </w:pPr>
-          <w:hyperlink w:anchor="_Toc225207704" w:history="1">
+          <w:hyperlink w:anchor="_Toc225208646" w:history="1">
             <w:r>
               <w:rPr>
                 <w:rStyle w:val="Hyperlink"/>
@@ -2172,7 +2172,7 @@
                 <w:noProof/>
                 <w:webHidden/>
               </w:rPr>
-              <w:instrText xml:space="preserve"> PAGEREF _Toc225207704 \h </w:instrText>
+              <w:instrText xml:space="preserve"> PAGEREF _Toc225208646 \h </w:instrText>
             </w:r>
             <w:r>
               <w:rPr>
@@ -2219,7 +2219,7 @@
               <w14:ligatures w14:val="standardContextual"/>
             </w:rPr>
           </w:pPr>
-          <w:hyperlink w:anchor="_Toc225207705" w:history="1">
+          <w:hyperlink w:anchor="_Toc225208647" w:history="1">
             <w:r>
               <w:rPr>
                 <w:rStyle w:val="Hyperlink"/>
@@ -2267,7 +2267,7 @@
                 <w:noProof/>
                 <w:webHidden/>
               </w:rPr>
-              <w:instrText xml:space="preserve"> PAGEREF _Toc225207705 \h </w:instrText>
+              <w:instrText xml:space="preserve"> PAGEREF _Toc225208647 \h </w:instrText>
             </w:r>
             <w:r>
               <w:rPr>
@@ -2314,7 +2314,7 @@
               <w14:ligatures w14:val="standardContextual"/>
             </w:rPr>
           </w:pPr>
-          <w:hyperlink w:anchor="_Toc225207706" w:history="1">
+          <w:hyperlink w:anchor="_Toc225208648" w:history="1">
             <w:r>
               <w:rPr>
                 <w:rStyle w:val="Hyperlink"/>
@@ -2362,7 +2362,7 @@
                 <w:noProof/>
                 <w:webHidden/>
               </w:rPr>
-              <w:instrText xml:space="preserve"> PAGEREF _Toc225207706 \h </w:instrText>
+              <w:instrText xml:space="preserve"> PAGEREF _Toc225208648 \h </w:instrText>
             </w:r>
             <w:r>
               <w:rPr>
@@ -2409,7 +2409,7 @@
               <w14:ligatures w14:val="standardContextual"/>
             </w:rPr>
           </w:pPr>
-          <w:hyperlink w:anchor="_Toc225207707" w:history="1">
+          <w:hyperlink w:anchor="_Toc225208649" w:history="1">
             <w:r>
               <w:rPr>
                 <w:rStyle w:val="Hyperlink"/>
@@ -2457,7 +2457,7 @@
                 <w:noProof/>
                 <w:webHidden/>
               </w:rPr>
-              <w:instrText xml:space="preserve"> PAGEREF _Toc225207707 \h </w:instrText>
+              <w:instrText xml:space="preserve"> PAGEREF _Toc225208649 \h </w:instrText>
             </w:r>
             <w:r>
               <w:rPr>
@@ -2511,7 +2511,7 @@
       <w:bookmarkStart w:id="5" w:name="_Toc412572569"/>
       <w:bookmarkStart w:id="6" w:name="_Toc509167633"/>
       <w:bookmarkStart w:id="7" w:name="_Toc223208168"/>
-      <w:bookmarkStart w:id="8" w:name="_Toc225207685"/>
+      <w:bookmarkStart w:id="8" w:name="_Toc225208627"/>
       <w:bookmarkEnd w:id="4"/>
       <w:bookmarkEnd w:id="3"/>
       <w:bookmarkEnd w:id="2"/>
@@ -2537,7 +2537,7 @@
       <w:bookmarkStart w:id="9" w:name="_Toc412572572"/>
       <w:bookmarkStart w:id="10" w:name="_Toc509167636"/>
       <w:bookmarkStart w:id="11" w:name="_Toc223208169"/>
-      <w:bookmarkStart w:id="12" w:name="_Toc225207686"/>
+      <w:bookmarkStart w:id="12" w:name="_Toc225208628"/>
       <w:r>
         <w:t xml:space="preserve">the </w:t>
       </w:r>
@@ -2606,8 +2606,8 @@
         <w:pStyle w:val="Heading1"/>
       </w:pPr>
       <w:bookmarkStart w:id="13" w:name="_Toc223208170"/>
-      <w:bookmarkStart w:id="14" w:name="_Toc225207687"/>
-      <w:bookmarkStart w:id="15" w:name="_Hlk314571188"/>
+      <w:bookmarkStart w:id="14" w:name="_Hlk314571188"/>
+      <w:bookmarkStart w:id="15" w:name="_Toc225208629"/>
       <w:r>
         <w:t>Model</w:t>
       </w:r>
@@ -2615,7 +2615,7 @@
         <w:t xml:space="preserve"> description</w:t>
       </w:r>
       <w:bookmarkEnd w:id="13"/>
-      <w:bookmarkEnd w:id="14"/>
+      <w:bookmarkEnd w:id="15"/>
     </w:p>
     <w:p>
       <w:pPr>
@@ -2625,7 +2625,7 @@
       </w:pPr>
       <w:bookmarkStart w:id="16" w:name="_Toc462595272"/>
       <w:bookmarkStart w:id="17" w:name="_Toc223208171"/>
-      <w:bookmarkStart w:id="18" w:name="_Toc225207688"/>
+      <w:bookmarkStart w:id="18" w:name="_Toc225208630"/>
       <w:r>
         <w:t>Definitions &amp; Acronyms</w:t>
       </w:r>
@@ -2896,7 +2896,7 @@
       <w:bookmarkStart w:id="19" w:name="_Toc412572574"/>
       <w:bookmarkStart w:id="20" w:name="_Toc509167638"/>
       <w:bookmarkStart w:id="21" w:name="_Toc223208172"/>
-      <w:bookmarkStart w:id="22" w:name="_Toc225207689"/>
+      <w:bookmarkStart w:id="22" w:name="_Toc225208631"/>
       <w:r>
         <w:lastRenderedPageBreak/>
         <w:t>Logical Scheme</w:t>
@@ -2906,7 +2906,7 @@
       <w:bookmarkEnd w:id="21"/>
       <w:bookmarkEnd w:id="22"/>
     </w:p>
-    <w:bookmarkEnd w:id="15"/>
+    <w:bookmarkEnd w:id="14"/>
     <w:p>
       <w:pPr>
         <w:pStyle w:val="NormalWeb"/>
@@ -3167,7 +3167,7 @@
         <w:keepNext w:val="0"/>
         <w:ind w:left="851" w:hanging="851"/>
       </w:pPr>
-      <w:bookmarkStart w:id="24" w:name="_Toc225207690"/>
+      <w:bookmarkStart w:id="24" w:name="_Toc225208632"/>
       <w:r>
         <w:lastRenderedPageBreak/>
         <w:t>O</w:t>
@@ -3183,7 +3183,7 @@
         <w:pStyle w:val="Heading3"/>
         <w:spacing w:before="360"/>
       </w:pPr>
-      <w:bookmarkStart w:id="25" w:name="_Toc225207691"/>
+      <w:bookmarkStart w:id="25" w:name="_Toc225208633"/>
       <w:r>
         <w:t>r</w:t>
       </w:r>
@@ -3660,7 +3660,7 @@
         <w:pStyle w:val="Heading3"/>
         <w:spacing w:before="360"/>
       </w:pPr>
-      <w:bookmarkStart w:id="26" w:name="_Toc225207692"/>
+      <w:bookmarkStart w:id="26" w:name="_Toc225208634"/>
       <w:r>
         <w:t>c</w:t>
       </w:r>
@@ -4232,7 +4232,7 @@
         <w:pStyle w:val="Heading3"/>
         <w:spacing w:before="360"/>
       </w:pPr>
-      <w:bookmarkStart w:id="27" w:name="_Toc225207693"/>
+      <w:bookmarkStart w:id="27" w:name="_Toc225208635"/>
       <w:r>
         <w:lastRenderedPageBreak/>
         <w:t>cities</w:t>
@@ -4789,7 +4789,7 @@
       <w:pPr>
         <w:pStyle w:val="Heading3"/>
       </w:pPr>
-      <w:bookmarkStart w:id="28" w:name="_Toc225207694"/>
+      <w:bookmarkStart w:id="28" w:name="_Toc225208636"/>
       <w:r>
         <w:t>s</w:t>
       </w:r>
@@ -5421,7 +5421,7 @@
       <w:pPr>
         <w:pStyle w:val="Heading3"/>
       </w:pPr>
-      <w:bookmarkStart w:id="29" w:name="_Toc225207695"/>
+      <w:bookmarkStart w:id="29" w:name="_Toc225208637"/>
       <w:r>
         <w:t>services</w:t>
       </w:r>
@@ -6069,7 +6069,7 @@
           <w:szCs w:val="20"/>
         </w:rPr>
       </w:pPr>
-      <w:bookmarkStart w:id="30" w:name="_Toc225207696"/>
+      <w:bookmarkStart w:id="30" w:name="_Toc225208638"/>
       <w:r>
         <w:t>companies</w:t>
       </w:r>
@@ -6798,7 +6798,7 @@
       <w:pPr>
         <w:pStyle w:val="Heading3"/>
       </w:pPr>
-      <w:bookmarkStart w:id="31" w:name="_Toc225207697"/>
+      <w:bookmarkStart w:id="31" w:name="_Toc225208639"/>
       <w:r>
         <w:t>company_representatives</w:t>
       </w:r>
@@ -8116,7 +8116,7 @@
       <w:pPr>
         <w:pStyle w:val="Heading3"/>
       </w:pPr>
-      <w:bookmarkStart w:id="32" w:name="_Toc225207698"/>
+      <w:bookmarkStart w:id="32" w:name="_Toc225208640"/>
       <w:r>
         <w:t>candidates</w:t>
       </w:r>
@@ -9331,7 +9331,7 @@
       <w:pPr>
         <w:pStyle w:val="Heading3"/>
       </w:pPr>
-      <w:bookmarkStart w:id="33" w:name="_Toc225207699"/>
+      <w:bookmarkStart w:id="33" w:name="_Toc225208641"/>
       <w:r>
         <w:lastRenderedPageBreak/>
         <w:t>candidate_skills</w:t>
@@ -10125,7 +10125,7 @@
       <w:pPr>
         <w:pStyle w:val="Heading3"/>
       </w:pPr>
-      <w:bookmarkStart w:id="34" w:name="_Toc225207700"/>
+      <w:bookmarkStart w:id="34" w:name="_Toc225208642"/>
       <w:r>
         <w:t>candidate_preferred_locations</w:t>
       </w:r>
@@ -10788,7 +10788,7 @@
       <w:pPr>
         <w:pStyle w:val="Heading3"/>
       </w:pPr>
-      <w:bookmarkStart w:id="35" w:name="_Toc225207701"/>
+      <w:bookmarkStart w:id="35" w:name="_Toc225208643"/>
       <w:r>
         <w:t>work_experience</w:t>
       </w:r>
@@ -11965,7 +11965,7 @@
       <w:pPr>
         <w:pStyle w:val="Heading3"/>
       </w:pPr>
-      <w:bookmarkStart w:id="36" w:name="_Toc225207702"/>
+      <w:bookmarkStart w:id="36" w:name="_Toc225208644"/>
       <w:r>
         <w:t>candidate_services</w:t>
       </w:r>
@@ -13159,7 +13159,7 @@
       <w:pPr>
         <w:pStyle w:val="Heading3"/>
       </w:pPr>
-      <w:bookmarkStart w:id="37" w:name="_Toc225207703"/>
+      <w:bookmarkStart w:id="37" w:name="_Toc225208645"/>
       <w:r>
         <w:t>jobs</w:t>
       </w:r>
@@ -15142,7 +15142,7 @@
       <w:pPr>
         <w:pStyle w:val="Heading3"/>
       </w:pPr>
-      <w:bookmarkStart w:id="38" w:name="_Toc225207704"/>
+      <w:bookmarkStart w:id="38" w:name="_Toc225208646"/>
       <w:r>
         <w:t>applications</w:t>
       </w:r>
@@ -15853,7 +15853,7 @@
       <w:pPr>
         <w:pStyle w:val="Heading3"/>
       </w:pPr>
-      <w:bookmarkStart w:id="39" w:name="_Toc225207705"/>
+      <w:bookmarkStart w:id="39" w:name="_Toc225208647"/>
       <w:r>
         <w:t>application_status_history</w:t>
       </w:r>
@@ -16787,7 +16787,7 @@
       <w:pPr>
         <w:pStyle w:val="Heading3"/>
       </w:pPr>
-      <w:bookmarkStart w:id="40" w:name="_Toc225207706"/>
+      <w:bookmarkStart w:id="40" w:name="_Toc225208648"/>
       <w:r>
         <w:lastRenderedPageBreak/>
         <w:t>interviews</w:t>
@@ -18147,7 +18147,7 @@
       <w:pPr>
         <w:pStyle w:val="Heading3"/>
       </w:pPr>
-      <w:bookmarkStart w:id="41" w:name="_Toc225207707"/>
+      <w:bookmarkStart w:id="41" w:name="_Toc225208649"/>
       <w:r>
         <w:t>placements</w:t>
       </w:r>
@@ -19768,7 +19768,7 @@
             </wp:anchor>
           </w:drawing>
         </mc:Choice>
-        <mc:Fallback xmlns:a14="http://schemas.microsoft.com/office/drawing/2010/main" xmlns:pic="http://schemas.openxmlformats.org/drawingml/2006/picture" xmlns:a="http://schemas.openxmlformats.org/drawingml/2006/main">
+        <mc:Fallback xmlns:a="http://schemas.openxmlformats.org/drawingml/2006/main" xmlns:pic="http://schemas.openxmlformats.org/drawingml/2006/picture" xmlns:a14="http://schemas.microsoft.com/office/drawing/2010/main">
           <w:pict>
             <v:line id="Straight Connector 7" style="position:absolute;z-index:251661312;visibility:visible;mso-wrap-style:square;mso-width-percent:0;mso-height-percent:0;mso-wrap-distance-left:9pt;mso-wrap-distance-top:0;mso-wrap-distance-right:9pt;mso-wrap-distance-bottom:0;mso-position-horizontal:absolute;mso-position-horizontal-relative:text;mso-position-vertical:absolute;mso-position-vertical-relative:text;mso-width-percent:0;mso-height-percent:0;mso-width-relative:margin;mso-height-relative:page" o:spid="_x0000_s1026" strokecolor="#393737 [814]" strokeweight="2pt" from=".45pt,1.05pt" to="469.15pt,1.05pt" w14:anchorId="6A4D861F" o:gfxdata="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">
               <v:stroke joinstyle="miter"/>
@@ -24299,6 +24299,32 @@
 </file>
 
 <file path=customXml/item1.xml><?xml version="1.0" encoding="utf-8"?>
+<p:properties xmlns:p="http://schemas.microsoft.com/office/2006/metadata/properties" xmlns:xsi="http://www.w3.org/2001/XMLSchema-instance" xmlns:pc="http://schemas.microsoft.com/office/infopath/2007/PartnerControls">
+  <documentManagement>
+    <SharedWithUsers xmlns="a156e92d-423a-4625-9818-f5e87239af8a">
+      <UserInfo>
+        <DisplayName/>
+        <AccountId xsi:nil="true"/>
+        <AccountType/>
+      </UserInfo>
+    </SharedWithUsers>
+    <lcf76f155ced4ddcb4097134ff3c332f xmlns="a60d0634-94da-4e6e-b36f-66eaaf0b6f4e">
+      <Terms xmlns="http://schemas.microsoft.com/office/infopath/2007/PartnerControls"/>
+    </lcf76f155ced4ddcb4097134ff3c332f>
+  </documentManagement>
+</p:properties>
+</file>
+
+<file path=customXml/item2.xml><?xml version="1.0" encoding="utf-8"?>
+<?mso-contentType ?>
+<FormTemplates xmlns="http://schemas.microsoft.com/sharepoint/v3/contenttype/forms">
+  <Display>DocumentLibraryForm</Display>
+  <Edit>DocumentLibraryForm</Edit>
+  <New>DocumentLibraryForm</New>
+</FormTemplates>
+</file>
+
+<file path=customXml/item3.xml><?xml version="1.0" encoding="utf-8"?>
 <ct:contentTypeSchema xmlns:ct="http://schemas.microsoft.com/office/2006/metadata/contentType" xmlns:ma="http://schemas.microsoft.com/office/2006/metadata/properties/metaAttributes" ct:_="" ma:_="" ma:contentTypeName="Document" ma:contentTypeID="0x010100F71F8A81E89B1E4A872028645FD1B6AE" ma:contentTypeVersion="11" ma:contentTypeDescription="Create a new document." ma:contentTypeScope="" ma:versionID="00e7a2aec32c88b8ca7efc9843325748">
   <xsd:schema xmlns:xsd="http://www.w3.org/2001/XMLSchema" xmlns:xs="http://www.w3.org/2001/XMLSchema" xmlns:p="http://schemas.microsoft.com/office/2006/metadata/properties" xmlns:ns2="a60d0634-94da-4e6e-b36f-66eaaf0b6f4e" xmlns:ns3="a156e92d-423a-4625-9818-f5e87239af8a" targetNamespace="http://schemas.microsoft.com/office/2006/metadata/properties" ma:root="true" ma:fieldsID="f6caa66f0c7935a35dae6e174e32ee4b" ns2:_="" ns3:_="">
     <xsd:import namespace="a60d0634-94da-4e6e-b36f-66eaaf0b6f4e"/>
@@ -24503,33 +24529,26 @@
 </ct:contentTypeSchema>
 </file>
 
-<file path=customXml/item2.xml><?xml version="1.0" encoding="utf-8"?>
-<?mso-contentType ?>
-<FormTemplates xmlns="http://schemas.microsoft.com/sharepoint/v3/contenttype/forms">
-  <Display>DocumentLibraryForm</Display>
-  <Edit>DocumentLibraryForm</Edit>
-  <New>DocumentLibraryForm</New>
-</FormTemplates>
+<file path=customXml/itemProps1.xml><?xml version="1.0" encoding="utf-8"?>
+<ds:datastoreItem xmlns:ds="http://schemas.openxmlformats.org/officeDocument/2006/customXml" ds:itemID="{E4B4D352-B35B-4B3A-95D2-902933709BD2}">
+  <ds:schemaRefs>
+    <ds:schemaRef ds:uri="http://schemas.microsoft.com/office/2006/metadata/properties"/>
+    <ds:schemaRef ds:uri="http://schemas.microsoft.com/office/infopath/2007/PartnerControls"/>
+    <ds:schemaRef ds:uri="a156e92d-423a-4625-9818-f5e87239af8a"/>
+    <ds:schemaRef ds:uri="a60d0634-94da-4e6e-b36f-66eaaf0b6f4e"/>
+  </ds:schemaRefs>
+</ds:datastoreItem>
 </file>
 
-<file path=customXml/item3.xml><?xml version="1.0" encoding="utf-8"?>
-<p:properties xmlns:p="http://schemas.microsoft.com/office/2006/metadata/properties" xmlns:xsi="http://www.w3.org/2001/XMLSchema-instance" xmlns:pc="http://schemas.microsoft.com/office/infopath/2007/PartnerControls">
-  <documentManagement>
-    <SharedWithUsers xmlns="a156e92d-423a-4625-9818-f5e87239af8a">
-      <UserInfo>
-        <DisplayName/>
-        <AccountId xsi:nil="true"/>
-        <AccountType/>
-      </UserInfo>
-    </SharedWithUsers>
-    <lcf76f155ced4ddcb4097134ff3c332f xmlns="a60d0634-94da-4e6e-b36f-66eaaf0b6f4e">
-      <Terms xmlns="http://schemas.microsoft.com/office/infopath/2007/PartnerControls"/>
-    </lcf76f155ced4ddcb4097134ff3c332f>
-  </documentManagement>
-</p:properties>
+<file path=customXml/itemProps2.xml><?xml version="1.0" encoding="utf-8"?>
+<ds:datastoreItem xmlns:ds="http://schemas.openxmlformats.org/officeDocument/2006/customXml" ds:itemID="{CEAD825D-2413-46BA-BB1F-DCE637B19B0C}">
+  <ds:schemaRefs>
+    <ds:schemaRef ds:uri="http://schemas.microsoft.com/sharepoint/v3/contenttype/forms"/>
+  </ds:schemaRefs>
+</ds:datastoreItem>
 </file>
 
-<file path=customXml/itemProps1.xml><?xml version="1.0" encoding="utf-8"?>
+<file path=customXml/itemProps3.xml><?xml version="1.0" encoding="utf-8"?>
 <ds:datastoreItem xmlns:ds="http://schemas.openxmlformats.org/officeDocument/2006/customXml" ds:itemID="{5C451799-F9B0-43E0-ABE9-80ABBAA59FE8}">
   <ds:schemaRefs>
     <ds:schemaRef ds:uri="http://schemas.microsoft.com/office/2006/metadata/contentType"/>
@@ -24546,23 +24565,4 @@
     <ds:schemaRef ds:uri="http://schemas.microsoft.com/internal/obd"/>
   </ds:schemaRefs>
 </ds:datastoreItem>
-</file>
-
-<file path=customXml/itemProps2.xml><?xml version="1.0" encoding="utf-8"?>
-<ds:datastoreItem xmlns:ds="http://schemas.openxmlformats.org/officeDocument/2006/customXml" ds:itemID="{CEAD825D-2413-46BA-BB1F-DCE637B19B0C}">
-  <ds:schemaRefs>
-    <ds:schemaRef ds:uri="http://schemas.microsoft.com/sharepoint/v3/contenttype/forms"/>
-  </ds:schemaRefs>
-</ds:datastoreItem>
-</file>
-
-<file path=customXml/itemProps3.xml><?xml version="1.0" encoding="utf-8"?>
-<ds:datastoreItem xmlns:ds="http://schemas.openxmlformats.org/officeDocument/2006/customXml" ds:itemID="{E4B4D352-B35B-4B3A-95D2-902933709BD2}">
-  <ds:schemaRefs>
-    <ds:schemaRef ds:uri="http://schemas.microsoft.com/office/2006/metadata/properties"/>
-    <ds:schemaRef ds:uri="http://schemas.microsoft.com/office/infopath/2007/PartnerControls"/>
-    <ds:schemaRef ds:uri="a156e92d-423a-4625-9818-f5e87239af8a"/>
-    <ds:schemaRef ds:uri="a60d0634-94da-4e6e-b36f-66eaaf0b6f4e"/>
-  </ds:schemaRefs>
-</ds:datastoreItem>
 </file>
</xml_diff>